<commit_message>
ci: restructure bibliography configuration and update citation commands
</commit_message>
<xml_diff>
--- a/thesis/thesis.docx
+++ b/thesis/thesis.docx
@@ -873,12 +873,6 @@
         <w:t xml:space="preserve">All human beings are born free and equal in dignity and rights. They are endowed with reason and conscience and should act towards one another in a spirit of brotherhood.</w:t>
       </w:r>
       <w:r>
-        <w:t xml:space="preserve"> </w:t>
-      </w:r>
-      <w:r>
-        <w:t xml:space="preserve">United Nations</w:t>
-      </w:r>
-      <w:r>
         <w:rPr>
           <w:rStyle w:val="FootnoteReference"/>
         </w:rPr>
@@ -5629,7 +5623,7 @@
       </w:r>
     </w:p>
     <w:bookmarkEnd w:id="206"/>
-    <w:bookmarkStart w:id="213" w:name="bibliography"/>
+    <w:bookmarkStart w:id="211" w:name="bibliography"/>
     <w:p>
       <w:pPr>
         <w:pStyle w:val="Heading1"/>
@@ -5638,7 +5632,7 @@
         <w:t xml:space="preserve">Bibliography</w:t>
       </w:r>
     </w:p>
-    <w:bookmarkStart w:id="209" w:name="sources"/>
+    <w:bookmarkStart w:id="208" w:name="sources"/>
     <w:p>
       <w:pPr>
         <w:pStyle w:val="Heading2"/>
@@ -5647,208 +5641,22 @@
         <w:t xml:space="preserve">Sources</w:t>
       </w:r>
     </w:p>
-    <w:bookmarkStart w:id="208" w:name="refs_sources"/>
-    <w:bookmarkStart w:id="207" w:name="ref-unitednations1948"/>
-    <w:p>
-      <w:pPr>
-        <w:pStyle w:val="FirstParagraph"/>
-      </w:pPr>
-      <w:r>
-        <w:t xml:space="preserve">Nations, United.</w:t>
-      </w:r>
-      <w:r>
-        <w:t xml:space="preserve"> </w:t>
-      </w:r>
-      <w:r>
-        <w:rPr>
-          <w:i/>
-          <w:iCs/>
-        </w:rPr>
-        <w:t xml:space="preserve">Universal</w:t>
-      </w:r>
-      <w:r>
-        <w:rPr>
-          <w:i/>
-          <w:iCs/>
-        </w:rPr>
-        <w:t xml:space="preserve"> </w:t>
-      </w:r>
-      <w:r>
-        <w:rPr>
-          <w:i/>
-          <w:iCs/>
-        </w:rPr>
-        <w:t xml:space="preserve">Declaration</w:t>
-      </w:r>
-      <w:r>
-        <w:rPr>
-          <w:i/>
-          <w:iCs/>
-        </w:rPr>
-        <w:t xml:space="preserve"> </w:t>
-      </w:r>
-      <w:r>
-        <w:rPr>
-          <w:i/>
-          <w:iCs/>
-        </w:rPr>
-        <w:t xml:space="preserve">of</w:t>
-      </w:r>
-      <w:r>
-        <w:rPr>
-          <w:i/>
-          <w:iCs/>
-        </w:rPr>
-        <w:t xml:space="preserve"> </w:t>
-      </w:r>
-      <w:r>
-        <w:rPr>
-          <w:i/>
-          <w:iCs/>
-        </w:rPr>
-        <w:t xml:space="preserve">Human</w:t>
-      </w:r>
-      <w:r>
-        <w:rPr>
-          <w:i/>
-          <w:iCs/>
-        </w:rPr>
-        <w:t xml:space="preserve"> </w:t>
-      </w:r>
-      <w:r>
-        <w:rPr>
-          <w:i/>
-          <w:iCs/>
-        </w:rPr>
-        <w:t xml:space="preserve">Rights</w:t>
-      </w:r>
-      <w:r>
-        <w:t xml:space="preserve">. 1948.</w:t>
-      </w:r>
-    </w:p>
+    <w:bookmarkStart w:id="207" w:name="refs_sources"/>
     <w:bookmarkEnd w:id="207"/>
     <w:bookmarkEnd w:id="208"/>
+    <w:bookmarkStart w:id="210" w:name="literature"/>
+    <w:p>
+      <w:pPr>
+        <w:pStyle w:val="Heading2"/>
+      </w:pPr>
+      <w:r>
+        <w:t xml:space="preserve">Literature</w:t>
+      </w:r>
+    </w:p>
+    <w:bookmarkStart w:id="209" w:name="refs_main"/>
     <w:bookmarkEnd w:id="209"/>
-    <w:bookmarkStart w:id="212" w:name="literature"/>
-    <w:p>
-      <w:pPr>
-        <w:pStyle w:val="Heading2"/>
-      </w:pPr>
-      <w:r>
-        <w:t xml:space="preserve">Literature</w:t>
-      </w:r>
-    </w:p>
-    <w:bookmarkStart w:id="211" w:name="refs_main"/>
-    <w:bookmarkStart w:id="210" w:name="ref-brown2016"/>
-    <w:p>
-      <w:pPr>
-        <w:pStyle w:val="FirstParagraph"/>
-      </w:pPr>
-      <w:r>
-        <w:t xml:space="preserve">Brown, Gordon, ed.</w:t>
-      </w:r>
-      <w:r>
-        <w:t xml:space="preserve"> </w:t>
-      </w:r>
-      <w:r>
-        <w:rPr>
-          <w:i/>
-          <w:iCs/>
-        </w:rPr>
-        <w:t xml:space="preserve">The</w:t>
-      </w:r>
-      <w:r>
-        <w:rPr>
-          <w:i/>
-          <w:iCs/>
-        </w:rPr>
-        <w:t xml:space="preserve"> </w:t>
-      </w:r>
-      <w:r>
-        <w:rPr>
-          <w:i/>
-          <w:iCs/>
-        </w:rPr>
-        <w:t xml:space="preserve">Universal</w:t>
-      </w:r>
-      <w:r>
-        <w:rPr>
-          <w:i/>
-          <w:iCs/>
-        </w:rPr>
-        <w:t xml:space="preserve"> </w:t>
-      </w:r>
-      <w:r>
-        <w:rPr>
-          <w:i/>
-          <w:iCs/>
-        </w:rPr>
-        <w:t xml:space="preserve">Declaration</w:t>
-      </w:r>
-      <w:r>
-        <w:rPr>
-          <w:i/>
-          <w:iCs/>
-        </w:rPr>
-        <w:t xml:space="preserve"> </w:t>
-      </w:r>
-      <w:r>
-        <w:rPr>
-          <w:i/>
-          <w:iCs/>
-        </w:rPr>
-        <w:t xml:space="preserve">of</w:t>
-      </w:r>
-      <w:r>
-        <w:rPr>
-          <w:i/>
-          <w:iCs/>
-        </w:rPr>
-        <w:t xml:space="preserve"> </w:t>
-      </w:r>
-      <w:r>
-        <w:rPr>
-          <w:i/>
-          <w:iCs/>
-        </w:rPr>
-        <w:t xml:space="preserve">Human</w:t>
-      </w:r>
-      <w:r>
-        <w:rPr>
-          <w:i/>
-          <w:iCs/>
-        </w:rPr>
-        <w:t xml:space="preserve"> </w:t>
-      </w:r>
-      <w:r>
-        <w:rPr>
-          <w:i/>
-          <w:iCs/>
-        </w:rPr>
-        <w:t xml:space="preserve">Rights</w:t>
-      </w:r>
-      <w:r>
-        <w:rPr>
-          <w:i/>
-          <w:iCs/>
-        </w:rPr>
-        <w:t xml:space="preserve"> </w:t>
-      </w:r>
-      <w:r>
-        <w:rPr>
-          <w:i/>
-          <w:iCs/>
-        </w:rPr>
-        <w:t xml:space="preserve">in the 21st Century, a Living Document in a Changing World</w:t>
-      </w:r>
-      <w:r>
-        <w:t xml:space="preserve">. Cambridge, [New York]: Open Book Publishers ; NYU Global Institute for Advanced Study, 2016.</w:t>
-      </w:r>
-    </w:p>
     <w:bookmarkEnd w:id="210"/>
     <w:bookmarkEnd w:id="211"/>
-    <w:bookmarkEnd w:id="212"/>
-    <w:bookmarkEnd w:id="213"/>
     <w:sectPr>
       <w:footnotePr>
         <w:numRestart w:val="eachSect"/>
@@ -5915,91 +5723,12 @@
         <w:r>
           <w:rPr>
             <w:rStyle w:val="Hyperlink"/>
-            <w:i/>
-            <w:iCs/>
+            <w:b/>
+            <w:bCs/>
           </w:rPr>
-          <w:t xml:space="preserve">Universal</w:t>
-        </w:r>
-        <w:r>
-          <w:rPr>
-            <w:rStyle w:val="Hyperlink"/>
-            <w:i/>
-            <w:iCs/>
-          </w:rPr>
-          <w:t xml:space="preserve"> </w:t>
-        </w:r>
-        <w:r>
-          <w:rPr>
-            <w:rStyle w:val="Hyperlink"/>
-            <w:i/>
-            <w:iCs/>
-          </w:rPr>
-          <w:t xml:space="preserve">Declaration</w:t>
-        </w:r>
-        <w:r>
-          <w:rPr>
-            <w:rStyle w:val="Hyperlink"/>
-            <w:i/>
-            <w:iCs/>
-          </w:rPr>
-          <w:t xml:space="preserve"> </w:t>
-        </w:r>
-        <w:r>
-          <w:rPr>
-            <w:rStyle w:val="Hyperlink"/>
-            <w:i/>
-            <w:iCs/>
-          </w:rPr>
-          <w:t xml:space="preserve">of</w:t>
-        </w:r>
-        <w:r>
-          <w:rPr>
-            <w:rStyle w:val="Hyperlink"/>
-            <w:i/>
-            <w:iCs/>
-          </w:rPr>
-          <w:t xml:space="preserve"> </w:t>
-        </w:r>
-        <w:r>
-          <w:rPr>
-            <w:rStyle w:val="Hyperlink"/>
-            <w:i/>
-            <w:iCs/>
-          </w:rPr>
-          <w:t xml:space="preserve">Human</w:t>
-        </w:r>
-        <w:r>
-          <w:rPr>
-            <w:rStyle w:val="Hyperlink"/>
-            <w:i/>
-            <w:iCs/>
-          </w:rPr>
-          <w:t xml:space="preserve"> </w:t>
-        </w:r>
-        <w:r>
-          <w:rPr>
-            <w:rStyle w:val="Hyperlink"/>
-            <w:i/>
-            <w:iCs/>
-          </w:rPr>
-          <w:t xml:space="preserve">Rights</w:t>
-        </w:r>
-        <w:r>
-          <w:rPr>
-            <w:rStyle w:val="Hyperlink"/>
-          </w:rPr>
-          <w:t xml:space="preserve"> </w:t>
-        </w:r>
-        <w:r>
-          <w:rPr>
-            <w:rStyle w:val="Hyperlink"/>
-          </w:rPr>
-          <w:t xml:space="preserve">(1948)</w:t>
+          <w:t xml:space="preserve">unitednations1948?</w:t>
         </w:r>
       </w:hyperlink>
-      <w:r>
-        <w:t xml:space="preserve">.</w:t>
-      </w:r>
     </w:p>
   </w:footnote>
   <w:footnote w:id="35">
@@ -6020,13 +5749,12 @@
         <w:r>
           <w:rPr>
             <w:rStyle w:val="Hyperlink"/>
+            <w:b/>
+            <w:bCs/>
           </w:rPr>
-          <w:t xml:space="preserve">Nations</w:t>
+          <w:t xml:space="preserve">unitednations1948?</w:t>
         </w:r>
       </w:hyperlink>
-      <w:r>
-        <w:t xml:space="preserve">.</w:t>
-      </w:r>
     </w:p>
   </w:footnote>
 </w:footnotes>

</xml_diff>